<commit_message>
update application and instructors
</commit_message>
<xml_diff>
--- a/img/beam/beam_supplemental_2027.docx
+++ b/img/beam/beam_supplemental_2027.docx
@@ -62,108 +62,56 @@
     <w:p>
       <w:pPr>
         <w:jc w:val="left"/>
-        <w:rPr>
-          <w:b/>
-          <w:bCs/>
-        </w:rPr>
       </w:pPr>
       <w:proofErr w:type="gramStart"/>
       <w:r>
-        <w:rPr>
-          <w:b/>
-          <w:bCs/>
-        </w:rPr>
         <w:t>Name:_</w:t>
       </w:r>
       <w:proofErr w:type="gramEnd"/>
       <w:r>
-        <w:rPr>
-          <w:b/>
-          <w:bCs/>
-        </w:rPr>
         <w:t>_______________________________________________ Age:_____________</w:t>
       </w:r>
     </w:p>
     <w:p>
       <w:pPr>
         <w:jc w:val="left"/>
-        <w:rPr>
-          <w:b/>
-          <w:bCs/>
-        </w:rPr>
-      </w:pPr>
-    </w:p>
-    <w:p>
-      <w:pPr>
-        <w:jc w:val="left"/>
-        <w:rPr>
-          <w:b/>
-          <w:bCs/>
-        </w:rPr>
-      </w:pPr>
-      <w:r>
-        <w:rPr>
-          <w:b/>
-          <w:bCs/>
-        </w:rPr>
+      </w:pPr>
+    </w:p>
+    <w:p>
+      <w:pPr>
+        <w:jc w:val="left"/>
+      </w:pPr>
+      <w:r>
         <w:t>University: _______________________________</w:t>
       </w:r>
       <w:r>
-        <w:rPr>
-          <w:b/>
-          <w:bCs/>
-        </w:rPr>
         <w:tab/>
         <w:t xml:space="preserve">Year of </w:t>
       </w:r>
       <w:proofErr w:type="gramStart"/>
       <w:r>
-        <w:rPr>
-          <w:b/>
-          <w:bCs/>
-        </w:rPr>
         <w:t>Graduation:_</w:t>
       </w:r>
       <w:proofErr w:type="gramEnd"/>
       <w:r>
-        <w:rPr>
-          <w:b/>
-          <w:bCs/>
-        </w:rPr>
         <w:t>__________</w:t>
       </w:r>
     </w:p>
     <w:p>
       <w:pPr>
         <w:jc w:val="left"/>
-        <w:rPr>
-          <w:b/>
-          <w:bCs/>
-        </w:rPr>
-      </w:pPr>
-    </w:p>
-    <w:p>
-      <w:pPr>
-        <w:jc w:val="left"/>
-        <w:rPr>
-          <w:b/>
-          <w:bCs/>
-        </w:rPr>
+      </w:pPr>
+    </w:p>
+    <w:p>
+      <w:pPr>
+        <w:jc w:val="left"/>
       </w:pPr>
       <w:proofErr w:type="gramStart"/>
       <w:r>
-        <w:rPr>
-          <w:b/>
-          <w:bCs/>
-        </w:rPr>
         <w:t>Major:_</w:t>
       </w:r>
       <w:proofErr w:type="gramEnd"/>
       <w:r>
-        <w:rPr>
-          <w:b/>
-          <w:bCs/>
-        </w:rPr>
         <w:t>________________________________________________________________</w:t>
       </w:r>
     </w:p>
@@ -179,195 +127,120 @@
     <w:p>
       <w:pPr>
         <w:jc w:val="left"/>
-        <w:rPr>
-          <w:b/>
-          <w:bCs/>
-        </w:rPr>
-      </w:pPr>
-      <w:r>
-        <w:rPr>
-          <w:b/>
-          <w:bCs/>
-        </w:rPr>
+      </w:pPr>
+      <w:r>
         <w:t xml:space="preserve">Please complete this application </w:t>
       </w:r>
       <w:r>
         <w:rPr>
-          <w:b/>
-          <w:bCs/>
           <w:u w:val="single"/>
         </w:rPr>
         <w:t>electronically</w:t>
       </w:r>
       <w:r>
-        <w:rPr>
-          <w:b/>
-          <w:bCs/>
-        </w:rPr>
         <w:t xml:space="preserve">. Email this application and a copy of your resume as </w:t>
       </w:r>
       <w:r>
-        <w:rPr>
-          <w:b/>
-          <w:bCs/>
-        </w:rPr>
         <w:t>attachment</w:t>
       </w:r>
       <w:r>
-        <w:rPr>
-          <w:b/>
-          <w:bCs/>
-        </w:rPr>
         <w:t>s</w:t>
       </w:r>
       <w:r>
-        <w:rPr>
-          <w:b/>
-          <w:bCs/>
-        </w:rPr>
         <w:t xml:space="preserve"> to Jana Woerner (</w:t>
       </w:r>
       <w:hyperlink r:id="rId4" w:history="1">
         <w:r>
           <w:rPr>
             <w:rStyle w:val="Hyperlink"/>
-            <w:b/>
-            <w:bCs/>
           </w:rPr>
           <w:t>woernerj@msu.edu</w:t>
         </w:r>
       </w:hyperlink>
       <w:r>
-        <w:rPr>
-          <w:b/>
-          <w:bCs/>
-        </w:rPr>
-        <w:t xml:space="preserve">) with “BEAM Supplemental Application” in the subject line. </w:t>
-      </w:r>
-      <w:r>
-        <w:rPr>
-          <w:b/>
-          <w:bCs/>
-        </w:rPr>
+        <w:t xml:space="preserve">) </w:t>
+      </w:r>
+      <w:r>
+        <w:t>and Anne Ju Laberge (</w:t>
+      </w:r>
+      <w:hyperlink r:id="rId5" w:history="1">
+        <w:r>
+          <w:rPr>
+            <w:rStyle w:val="Hyperlink"/>
+          </w:rPr>
+          <w:t>laberge7@msu.edu</w:t>
+        </w:r>
+      </w:hyperlink>
+      <w:r>
+        <w:t xml:space="preserve">) </w:t>
+      </w:r>
+      <w:r>
+        <w:t xml:space="preserve">with “BEAM Supplemental Application” in the subject line. </w:t>
+      </w:r>
+      <w:r>
         <w:t>Please save both files as a pdf (“</w:t>
       </w:r>
       <w:proofErr w:type="spellStart"/>
       <w:r>
-        <w:rPr>
-          <w:b/>
-          <w:bCs/>
-        </w:rPr>
         <w:t>Lastname_Firstname_App</w:t>
       </w:r>
       <w:proofErr w:type="spellEnd"/>
       <w:r>
-        <w:rPr>
-          <w:b/>
-          <w:bCs/>
-        </w:rPr>
         <w:t>/Resume.pdf).</w:t>
       </w:r>
     </w:p>
     <w:p>
       <w:pPr>
         <w:jc w:val="left"/>
-        <w:rPr>
-          <w:b/>
-          <w:bCs/>
-        </w:rPr>
-      </w:pPr>
-    </w:p>
-    <w:p>
-      <w:pPr>
-        <w:jc w:val="left"/>
-        <w:rPr>
-          <w:b/>
-          <w:bCs/>
-        </w:rPr>
-      </w:pPr>
-      <w:r>
-        <w:rPr>
-          <w:b/>
-          <w:bCs/>
-        </w:rPr>
-        <w:t xml:space="preserve">This application is due on </w:t>
-      </w:r>
-      <w:r>
-        <w:rPr>
-          <w:b/>
-          <w:bCs/>
-        </w:rPr>
-        <w:t>February 15</w:t>
-      </w:r>
-      <w:r>
-        <w:rPr>
-          <w:b/>
-          <w:bCs/>
+      </w:pPr>
+    </w:p>
+    <w:p>
+      <w:pPr>
+        <w:jc w:val="left"/>
+      </w:pPr>
+      <w:r>
+        <w:t>We will review applications on a rolling basis as they are received. The official deadline for all applications is</w:t>
+      </w:r>
+      <w:r>
+        <w:t xml:space="preserve"> </w:t>
+      </w:r>
+      <w:r>
+        <w:t>February 1</w:t>
+      </w:r>
+      <w:r>
+        <w:rPr>
           <w:vertAlign w:val="superscript"/>
         </w:rPr>
-        <w:t>th</w:t>
-      </w:r>
-      <w:r>
-        <w:rPr>
-          <w:b/>
-          <w:bCs/>
-        </w:rPr>
+        <w:t>st</w:t>
+      </w:r>
+      <w:r>
         <w:t>,</w:t>
       </w:r>
       <w:r>
-        <w:rPr>
-          <w:b/>
-          <w:bCs/>
-        </w:rPr>
         <w:t xml:space="preserve"> 20</w:t>
       </w:r>
       <w:r>
-        <w:rPr>
-          <w:b/>
-          <w:bCs/>
-        </w:rPr>
         <w:t>27</w:t>
       </w:r>
       <w:r>
-        <w:rPr>
-          <w:b/>
-          <w:bCs/>
-        </w:rPr>
         <w:t>.</w:t>
       </w:r>
       <w:r>
-        <w:rPr>
-          <w:b/>
-          <w:bCs/>
-        </w:rPr>
         <w:t xml:space="preserve">  If you have any questions, please email </w:t>
       </w:r>
       <w:r>
-        <w:rPr>
-          <w:b/>
-          <w:bCs/>
-        </w:rPr>
-        <w:t xml:space="preserve">me </w:t>
-      </w:r>
-      <w:r>
-        <w:rPr>
-          <w:b/>
-          <w:bCs/>
-        </w:rPr>
+        <w:t>us</w:t>
+      </w:r>
+      <w:r>
+        <w:t xml:space="preserve"> </w:t>
+      </w:r>
+      <w:r>
         <w:sym w:font="Wingdings" w:char="F04A"/>
       </w:r>
       <w:r>
-        <w:rPr>
-          <w:b/>
-          <w:bCs/>
-        </w:rPr>
         <w:t xml:space="preserve"> </w:t>
       </w:r>
       <w:r>
-        <w:rPr>
-          <w:b/>
-          <w:bCs/>
-        </w:rPr>
         <w:t xml:space="preserve"> </w:t>
       </w:r>
     </w:p>

</xml_diff>